<commit_message>
L-0782: docs for the could-not-tell status line
Docs: updated - status.md, quickstart, diagram
</commit_message>
<xml_diff>
--- a/docs/guides/crew/crew-quickstart.docx
+++ b/docs/guides/crew/crew-quickstart.docx
@@ -1989,8 +1989,8 @@
         </w:tblCellMar>
       </w:tblPr>
       <w:tblGrid>
-        <w:gridCol w:w="4022"/>
-        <w:gridCol w:w="7317"/>
+        <w:gridCol w:w="3733"/>
+        <w:gridCol w:w="7606"/>
       </w:tblGrid>
       <w:tr>
         <w:trPr>
@@ -1998,7 +1998,7 @@
         </w:trPr>
         <w:tc>
           <w:tcPr>
-            <w:tcW w:w="4022" w:type="dxa"/>
+            <w:tcW w:w="3733" w:type="dxa"/>
             <w:tcBorders/>
             <w:vAlign w:val="center"/>
           </w:tcPr>
@@ -2020,7 +2020,7 @@
         </w:tc>
         <w:tc>
           <w:tcPr>
-            <w:tcW w:w="7317" w:type="dxa"/>
+            <w:tcW w:w="7606" w:type="dxa"/>
             <w:tcBorders/>
             <w:vAlign w:val="center"/>
           </w:tcPr>
@@ -2045,7 +2045,7 @@
         <w:trPr/>
         <w:tc>
           <w:tcPr>
-            <w:tcW w:w="4022" w:type="dxa"/>
+            <w:tcW w:w="3733" w:type="dxa"/>
             <w:tcBorders/>
             <w:vAlign w:val="center"/>
           </w:tcPr>
@@ -2072,7 +2072,7 @@
         </w:tc>
         <w:tc>
           <w:tcPr>
-            <w:tcW w:w="7317" w:type="dxa"/>
+            <w:tcW w:w="7606" w:type="dxa"/>
             <w:tcBorders/>
             <w:vAlign w:val="center"/>
           </w:tcPr>
@@ -2108,7 +2108,7 @@
         <w:trPr/>
         <w:tc>
           <w:tcPr>
-            <w:tcW w:w="4022" w:type="dxa"/>
+            <w:tcW w:w="3733" w:type="dxa"/>
             <w:tcBorders/>
             <w:vAlign w:val="center"/>
           </w:tcPr>
@@ -2141,7 +2141,7 @@
         </w:tc>
         <w:tc>
           <w:tcPr>
-            <w:tcW w:w="7317" w:type="dxa"/>
+            <w:tcW w:w="7606" w:type="dxa"/>
             <w:tcBorders/>
             <w:vAlign w:val="center"/>
           </w:tcPr>
@@ -2165,7 +2165,7 @@
         <w:trPr/>
         <w:tc>
           <w:tcPr>
-            <w:tcW w:w="4022" w:type="dxa"/>
+            <w:tcW w:w="3733" w:type="dxa"/>
             <w:tcBorders/>
             <w:vAlign w:val="center"/>
           </w:tcPr>
@@ -2192,7 +2192,7 @@
         </w:tc>
         <w:tc>
           <w:tcPr>
-            <w:tcW w:w="7317" w:type="dxa"/>
+            <w:tcW w:w="7606" w:type="dxa"/>
             <w:tcBorders/>
             <w:vAlign w:val="center"/>
           </w:tcPr>
@@ -2222,7 +2222,7 @@
         <w:trPr/>
         <w:tc>
           <w:tcPr>
-            <w:tcW w:w="4022" w:type="dxa"/>
+            <w:tcW w:w="3733" w:type="dxa"/>
             <w:tcBorders/>
             <w:vAlign w:val="center"/>
           </w:tcPr>
@@ -2236,6 +2236,63 @@
               <w:rPr/>
             </w:pPr>
             <w:r>
+              <w:rPr>
+                <w:rStyle w:val="SourceText"/>
+              </w:rPr>
+              <w:t>migrate could not tell - &lt;path&gt;: &lt;why&gt;</w:t>
+            </w:r>
+          </w:p>
+        </w:tc>
+        <w:tc>
+          <w:tcPr>
+            <w:tcW w:w="7606" w:type="dxa"/>
+            <w:tcBorders/>
+            <w:vAlign w:val="center"/>
+          </w:tcPr>
+          <w:p>
+            <w:pPr>
+              <w:pStyle w:val="TableContents"/>
+              <w:shd w:fill="2E3440" w:val="clear"/>
+              <w:bidi w:val="0"/>
+              <w:spacing w:before="120" w:after="120"/>
+              <w:jc w:val="left"/>
+              <w:rPr/>
+            </w:pPr>
+            <w:r>
+              <w:rPr/>
+              <w:t xml:space="preserve">fix or remove the named entry under </w:t>
+            </w:r>
+            <w:r>
+              <w:rPr>
+                <w:rStyle w:val="SourceText"/>
+              </w:rPr>
+              <w:t>.crew/backups/</w:t>
+            </w:r>
+            <w:r>
+              <w:rPr/>
+              <w:t>; the rest of the report is unaffected</w:t>
+            </w:r>
+          </w:p>
+        </w:tc>
+      </w:tr>
+      <w:tr>
+        <w:trPr/>
+        <w:tc>
+          <w:tcPr>
+            <w:tcW w:w="3733" w:type="dxa"/>
+            <w:tcBorders/>
+            <w:vAlign w:val="center"/>
+          </w:tcPr>
+          <w:p>
+            <w:pPr>
+              <w:pStyle w:val="TableContents"/>
+              <w:shd w:fill="2E3440" w:val="clear"/>
+              <w:bidi w:val="0"/>
+              <w:spacing w:before="120" w:after="120"/>
+              <w:jc w:val="left"/>
+              <w:rPr/>
+            </w:pPr>
+            <w:r>
               <w:rPr/>
               <w:t>a crew command cannot find Python</w:t>
             </w:r>
@@ -2243,7 +2300,7 @@
         </w:tc>
         <w:tc>
           <w:tcPr>
-            <w:tcW w:w="7317" w:type="dxa"/>
+            <w:tcW w:w="7606" w:type="dxa"/>
             <w:tcBorders/>
             <w:vAlign w:val="center"/>
           </w:tcPr>

</xml_diff>